<commit_message>
docs(milestone): update Milestone governance framework document
Refresh of the governance framework after the active delivery engagement
iterated on roles, cadence, and escalation paths. The timestamped
.bak-2026-04-21 sibling is intentionally gitignored (local safety copy).

Co-Authored-By: Claude Opus 4.7 (1M context) <noreply@anthropic.com>
</commit_message>
<xml_diff>
--- a/Milestone Group/Milestone_Governance_Framework.docx
+++ b/Milestone Group/Milestone_Governance_Framework.docx
@@ -87,13 +87,7 @@
     </w:p>
     <w:p>
       <w:r>
-        <w:rPr>
-          <w:rFonts w:ascii="Calibri" w:cs="Calibri" w:eastAsia="Calibri" w:hAnsi="Calibri"/>
-          <w:color w:val="000000"/>
-          <w:sz w:val="22"/>
-          <w:szCs w:val="22"/>
-        </w:rPr>
-        <w:t xml:space="preserve">Kyle Harbuck, Project Lead</w:t>
+        <w:t>Kyle Harbuck, Technical Oversight</w:t>
       </w:r>
     </w:p>
     <w:p>
@@ -606,15 +600,7 @@
               <w:jc w:val="left"/>
             </w:pPr>
             <w:r>
-              <w:rPr>
-                <w:rFonts w:ascii="Calibri" w:cs="Calibri" w:eastAsia="Calibri" w:hAnsi="Calibri"/>
-                <w:b w:val="false"/>
-                <w:bCs w:val="false"/>
-                <w:color w:val="000000"/>
-                <w:sz w:val="22"/>
-                <w:szCs w:val="22"/>
-              </w:rPr>
-              <w:t xml:space="preserve">Project Lead</w:t>
+              <w:t>Project Lead</w:t>
             </w:r>
           </w:p>
         </w:tc>
@@ -634,15 +620,7 @@
               <w:jc w:val="left"/>
             </w:pPr>
             <w:r>
-              <w:rPr>
-                <w:rFonts w:ascii="Calibri" w:cs="Calibri" w:eastAsia="Calibri" w:hAnsi="Calibri"/>
-                <w:b w:val="false"/>
-                <w:bCs w:val="false"/>
-                <w:color w:val="000000"/>
-                <w:sz w:val="22"/>
-                <w:szCs w:val="22"/>
-              </w:rPr>
-              <w:t xml:space="preserve">Kyle Harbuck</w:t>
+              <w:t>Weston Baker</w:t>
             </w:r>
           </w:p>
         </w:tc>
@@ -662,15 +640,7 @@
               <w:jc w:val="left"/>
             </w:pPr>
             <w:r>
-              <w:rPr>
-                <w:rFonts w:ascii="Calibri" w:cs="Calibri" w:eastAsia="Calibri" w:hAnsi="Calibri"/>
-                <w:b w:val="false"/>
-                <w:bCs w:val="false"/>
-                <w:color w:val="000000"/>
-                <w:sz w:val="22"/>
-                <w:szCs w:val="22"/>
-              </w:rPr>
-              <w:t xml:space="preserve">Day-to-day project leadership, HubSpot architecture, stakeholder management, delivery oversight</w:t>
+              <w:t>Day-to-day project management, HubSpot configuration and build, stakeholder coordination, deliverable ownership</w:t>
             </w:r>
           </w:p>
         </w:tc>
@@ -693,15 +663,7 @@
               <w:jc w:val="left"/>
             </w:pPr>
             <w:r>
-              <w:rPr>
-                <w:rFonts w:ascii="Calibri" w:cs="Calibri" w:eastAsia="Calibri" w:hAnsi="Calibri"/>
-                <w:b w:val="false"/>
-                <w:bCs w:val="false"/>
-                <w:color w:val="000000"/>
-                <w:sz w:val="22"/>
-                <w:szCs w:val="22"/>
-              </w:rPr>
-              <w:t xml:space="preserve">Project Support</w:t>
+              <w:t>Technical Oversight</w:t>
             </w:r>
           </w:p>
         </w:tc>
@@ -722,15 +684,7 @@
               <w:jc w:val="left"/>
             </w:pPr>
             <w:r>
-              <w:rPr>
-                <w:rFonts w:ascii="Calibri" w:cs="Calibri" w:eastAsia="Calibri" w:hAnsi="Calibri"/>
-                <w:b w:val="false"/>
-                <w:bCs w:val="false"/>
-                <w:color w:val="000000"/>
-                <w:sz w:val="22"/>
-                <w:szCs w:val="22"/>
-              </w:rPr>
-              <w:t xml:space="preserve">Weston Baker</w:t>
+              <w:t>Kyle Harbuck</w:t>
             </w:r>
           </w:p>
         </w:tc>
@@ -751,15 +705,7 @@
               <w:jc w:val="left"/>
             </w:pPr>
             <w:r>
-              <w:rPr>
-                <w:rFonts w:ascii="Calibri" w:cs="Calibri" w:eastAsia="Calibri" w:hAnsi="Calibri"/>
-                <w:b w:val="false"/>
-                <w:bCs w:val="false"/>
-                <w:color w:val="000000"/>
-                <w:sz w:val="22"/>
-                <w:szCs w:val="22"/>
-              </w:rPr>
-              <w:t xml:space="preserve">Operational coordination, governance documentation, scheduling, deliverable support</w:t>
+              <w:t>HubSpot architecture guidance, QA on configuration and data work, Steering Committee participation, escalation point</w:t>
             </w:r>
           </w:p>
         </w:tc>
@@ -924,15 +870,7 @@
               <w:jc w:val="left"/>
             </w:pPr>
             <w:r>
-              <w:rPr>
-                <w:rFonts w:ascii="Calibri" w:cs="Calibri" w:eastAsia="Calibri" w:hAnsi="Calibri"/>
-                <w:b w:val="false"/>
-                <w:bCs w:val="false"/>
-                <w:color w:val="000000"/>
-                <w:sz w:val="22"/>
-                <w:szCs w:val="22"/>
-              </w:rPr>
-              <w:t xml:space="preserve">Project Champion</w:t>
+              <w:t>Project Champion</w:t>
             </w:r>
           </w:p>
         </w:tc>
@@ -953,15 +891,7 @@
               <w:jc w:val="left"/>
             </w:pPr>
             <w:r>
-              <w:rPr>
-                <w:rFonts w:ascii="Calibri" w:cs="Calibri" w:eastAsia="Calibri" w:hAnsi="Calibri"/>
-                <w:b w:val="false"/>
-                <w:bCs w:val="false"/>
-                <w:color w:val="000000"/>
-                <w:sz w:val="22"/>
-                <w:szCs w:val="22"/>
-              </w:rPr>
-              <w:t xml:space="preserve">Jason Wise, Managing Director</w:t>
+              <w:t>Robert Strong</w:t>
             </w:r>
           </w:p>
         </w:tc>
@@ -982,15 +912,7 @@
               <w:jc w:val="left"/>
             </w:pPr>
             <w:r>
-              <w:rPr>
-                <w:rFonts w:ascii="Calibri" w:cs="Calibri" w:eastAsia="Calibri" w:hAnsi="Calibri"/>
-                <w:b w:val="false"/>
-                <w:bCs w:val="false"/>
-                <w:color w:val="000000"/>
-                <w:sz w:val="22"/>
-                <w:szCs w:val="22"/>
-              </w:rPr>
-              <w:t xml:space="preserve">Primary point of contact, removes blockers, ensures access to people and information, drives internal coordination</w:t>
+              <w:t>Primary day-to-day contact, removes blockers, ensures access to people and information, drives internal coordination, facilitates data exports from Outlook/Excel/Zoho, broker and acquisition-target coordination</w:t>
             </w:r>
           </w:p>
         </w:tc>
@@ -1005,22 +927,15 @@
               <w:bottom w:val="single" w:color="BCBCBC" w:sz="4"/>
               <w:right w:val="single" w:color="BCBCBC" w:sz="4"/>
             </w:tcBorders>
-          </w:tcPr>
-          <w:p>
-            <w:pPr>
-              <w:spacing w:after="80" w:before="80" w:line="300" w:lineRule="auto"/>
-              <w:jc w:val="left"/>
-            </w:pPr>
-            <w:r>
-              <w:rPr>
-                <w:rFonts w:ascii="Calibri" w:cs="Calibri" w:eastAsia="Calibri" w:hAnsi="Calibri"/>
-                <w:b w:val="false"/>
-                <w:bCs w:val="false"/>
-                <w:color w:val="000000"/>
-                <w:sz w:val="22"/>
-                <w:szCs w:val="22"/>
-              </w:rPr>
-              <w:t xml:space="preserve">Operations Lead</w:t>
+            <w:shd w:fill="E3E3E3" w:color="E3E3E3" w:val="solid"/>
+          </w:tcPr>
+          <w:p>
+            <w:pPr>
+              <w:spacing w:after="80" w:before="80" w:line="300" w:lineRule="auto"/>
+              <w:jc w:val="left"/>
+            </w:pPr>
+            <w:r>
+              <w:t>Executive Stakeholder</w:t>
             </w:r>
           </w:p>
         </w:tc>
@@ -1033,22 +948,15 @@
               <w:bottom w:val="single" w:color="BCBCBC" w:sz="4"/>
               <w:right w:val="single" w:color="BCBCBC" w:sz="4"/>
             </w:tcBorders>
-          </w:tcPr>
-          <w:p>
-            <w:pPr>
-              <w:spacing w:after="80" w:before="80" w:line="300" w:lineRule="auto"/>
-              <w:jc w:val="left"/>
-            </w:pPr>
-            <w:r>
-              <w:rPr>
-                <w:rFonts w:ascii="Calibri" w:cs="Calibri" w:eastAsia="Calibri" w:hAnsi="Calibri"/>
-                <w:b w:val="false"/>
-                <w:bCs w:val="false"/>
-                <w:color w:val="000000"/>
-                <w:sz w:val="22"/>
-                <w:szCs w:val="22"/>
-              </w:rPr>
-              <w:t xml:space="preserve">Robert Strong</w:t>
+            <w:shd w:fill="E3E3E3" w:color="E3E3E3" w:val="solid"/>
+          </w:tcPr>
+          <w:p>
+            <w:pPr>
+              <w:spacing w:after="80" w:before="80" w:line="300" w:lineRule="auto"/>
+              <w:jc w:val="left"/>
+            </w:pPr>
+            <w:r>
+              <w:t>Jason Wise, Managing Director</w:t>
             </w:r>
           </w:p>
         </w:tc>
@@ -1061,36 +969,6 @@
               <w:bottom w:val="single" w:color="BCBCBC" w:sz="4"/>
               <w:right w:val="single" w:color="BCBCBC" w:sz="4"/>
             </w:tcBorders>
-          </w:tcPr>
-          <w:p>
-            <w:pPr>
-              <w:spacing w:after="80" w:before="80" w:line="300" w:lineRule="auto"/>
-              <w:jc w:val="left"/>
-            </w:pPr>
-            <w:r>
-              <w:rPr>
-                <w:rFonts w:ascii="Calibri" w:cs="Calibri" w:eastAsia="Calibri" w:hAnsi="Calibri"/>
-                <w:b w:val="false"/>
-                <w:bCs w:val="false"/>
-                <w:color w:val="000000"/>
-                <w:sz w:val="22"/>
-                <w:szCs w:val="22"/>
-              </w:rPr>
-              <w:t xml:space="preserve">Facilitates access to SOPs, systems, and personnel; coordinates data exports from Outlook, Excel, and Zoho; broker and acquisition-target coordination</w:t>
-            </w:r>
-          </w:p>
-        </w:tc>
-      </w:tr>
-      <w:tr>
-        <w:tc>
-          <w:tcPr>
-            <w:tcW w:type="dxa" w:w="2400"/>
-            <w:tcBorders>
-              <w:top w:val="single" w:color="BCBCBC" w:sz="4"/>
-              <w:left w:val="single" w:color="BCBCBC" w:sz="4"/>
-              <w:bottom w:val="single" w:color="BCBCBC" w:sz="4"/>
-              <w:right w:val="single" w:color="BCBCBC" w:sz="4"/>
-            </w:tcBorders>
             <w:shd w:fill="E3E3E3" w:color="E3E3E3" w:val="solid"/>
           </w:tcPr>
           <w:p>
@@ -1099,73 +977,7 @@
               <w:jc w:val="left"/>
             </w:pPr>
             <w:r>
-              <w:rPr>
-                <w:rFonts w:ascii="Calibri" w:cs="Calibri" w:eastAsia="Calibri" w:hAnsi="Calibri"/>
-                <w:b w:val="false"/>
-                <w:bCs w:val="false"/>
-                <w:color w:val="000000"/>
-                <w:sz w:val="22"/>
-                <w:szCs w:val="22"/>
-              </w:rPr>
-              <w:t xml:space="preserve">Executive Stakeholder</w:t>
-            </w:r>
-          </w:p>
-        </w:tc>
-        <w:tc>
-          <w:tcPr>
-            <w:tcW w:type="dxa" w:w="2400"/>
-            <w:tcBorders>
-              <w:top w:val="single" w:color="BCBCBC" w:sz="4"/>
-              <w:left w:val="single" w:color="BCBCBC" w:sz="4"/>
-              <w:bottom w:val="single" w:color="BCBCBC" w:sz="4"/>
-              <w:right w:val="single" w:color="BCBCBC" w:sz="4"/>
-            </w:tcBorders>
-            <w:shd w:fill="E3E3E3" w:color="E3E3E3" w:val="solid"/>
-          </w:tcPr>
-          <w:p>
-            <w:pPr>
-              <w:spacing w:after="80" w:before="80" w:line="300" w:lineRule="auto"/>
-              <w:jc w:val="left"/>
-            </w:pPr>
-            <w:r>
-              <w:rPr>
-                <w:rFonts w:ascii="Calibri" w:cs="Calibri" w:eastAsia="Calibri" w:hAnsi="Calibri"/>
-                <w:b w:val="false"/>
-                <w:bCs w:val="false"/>
-                <w:color w:val="000000"/>
-                <w:sz w:val="22"/>
-                <w:szCs w:val="22"/>
-              </w:rPr>
-              <w:t xml:space="preserve">Jason Wise</w:t>
-            </w:r>
-          </w:p>
-        </w:tc>
-        <w:tc>
-          <w:tcPr>
-            <w:tcW w:type="dxa" w:w="5280"/>
-            <w:tcBorders>
-              <w:top w:val="single" w:color="BCBCBC" w:sz="4"/>
-              <w:left w:val="single" w:color="BCBCBC" w:sz="4"/>
-              <w:bottom w:val="single" w:color="BCBCBC" w:sz="4"/>
-              <w:right w:val="single" w:color="BCBCBC" w:sz="4"/>
-            </w:tcBorders>
-            <w:shd w:fill="E3E3E3" w:color="E3E3E3" w:val="solid"/>
-          </w:tcPr>
-          <w:p>
-            <w:pPr>
-              <w:spacing w:after="80" w:before="80" w:line="300" w:lineRule="auto"/>
-              <w:jc w:val="left"/>
-            </w:pPr>
-            <w:r>
-              <w:rPr>
-                <w:rFonts w:ascii="Calibri" w:cs="Calibri" w:eastAsia="Calibri" w:hAnsi="Calibri"/>
-                <w:b w:val="false"/>
-                <w:bCs w:val="false"/>
-                <w:color w:val="000000"/>
-                <w:sz w:val="22"/>
-                <w:szCs w:val="22"/>
-              </w:rPr>
-              <w:t xml:space="preserve">Strategic direction, deal value driver alignment, final sign-off on recommendations</w:t>
+              <w:t>Strategic direction, deal value driver alignment, final sign-off on recommendations</w:t>
             </w:r>
           </w:p>
         </w:tc>
@@ -1232,32 +1044,20 @@
         <w:spacing w:after="60" w:before="60" w:line="320" w:lineRule="auto"/>
       </w:pPr>
       <w:r>
-        <w:rPr>
-          <w:rFonts w:ascii="Calibri" w:cs="Calibri" w:eastAsia="Calibri" w:hAnsi="Calibri"/>
-          <w:color w:val="000000"/>
-          <w:sz w:val="22"/>
-          <w:szCs w:val="22"/>
-        </w:rPr>
-        <w:t xml:space="preserve">Jason Wise, Milestone Project Champion</w:t>
-      </w:r>
-    </w:p>
-    <w:p>
-      <w:pPr>
-        <w:pStyle w:val="ListParagraph"/>
-        <w:numPr>
-          <w:ilvl w:val="0"/>
-          <w:numId w:val="1"/>
-        </w:numPr>
-        <w:spacing w:after="60" w:before="60" w:line="320" w:lineRule="auto"/>
-      </w:pPr>
-      <w:r>
-        <w:rPr>
-          <w:rFonts w:ascii="Calibri" w:cs="Calibri" w:eastAsia="Calibri" w:hAnsi="Calibri"/>
-          <w:color w:val="000000"/>
-          <w:sz w:val="22"/>
-          <w:szCs w:val="22"/>
-        </w:rPr>
-        <w:t xml:space="preserve">Kyle Harbuck, Sayer Project Lead</w:t>
+        <w:t>Robert Strong, Milestone Project Champion</w:t>
+      </w:r>
+    </w:p>
+    <w:p>
+      <w:pPr>
+        <w:pStyle w:val="ListParagraph"/>
+        <w:numPr>
+          <w:ilvl w:val="0"/>
+          <w:numId w:val="1"/>
+        </w:numPr>
+        <w:spacing w:after="60" w:before="60" w:line="320" w:lineRule="auto"/>
+      </w:pPr>
+      <w:r>
+        <w:t>Weston Baker, Sayer Project Lead</w:t>
       </w:r>
     </w:p>
     <w:p>
@@ -1621,70 +1421,46 @@
         <w:spacing w:after="60" w:before="60" w:line="320" w:lineRule="auto"/>
       </w:pPr>
       <w:r>
-        <w:rPr>
-          <w:rFonts w:ascii="Calibri" w:cs="Calibri" w:eastAsia="Calibri" w:hAnsi="Calibri"/>
-          <w:color w:val="000000"/>
-          <w:sz w:val="22"/>
-          <w:szCs w:val="22"/>
-        </w:rPr>
-        <w:t xml:space="preserve">Kyle Harbuck (Sayer Project Lead)</w:t>
-      </w:r>
-    </w:p>
-    <w:p>
-      <w:pPr>
-        <w:pStyle w:val="ListParagraph"/>
-        <w:numPr>
-          <w:ilvl w:val="0"/>
-          <w:numId w:val="1"/>
-        </w:numPr>
-        <w:spacing w:after="60" w:before="60" w:line="320" w:lineRule="auto"/>
-      </w:pPr>
-      <w:r>
-        <w:rPr>
-          <w:rFonts w:ascii="Calibri" w:cs="Calibri" w:eastAsia="Calibri" w:hAnsi="Calibri"/>
-          <w:color w:val="000000"/>
-          <w:sz w:val="22"/>
-          <w:szCs w:val="22"/>
-        </w:rPr>
-        <w:t xml:space="preserve">Weston Baker (Sayer Project Support)</w:t>
-      </w:r>
-    </w:p>
-    <w:p>
-      <w:pPr>
-        <w:pStyle w:val="ListParagraph"/>
-        <w:numPr>
-          <w:ilvl w:val="0"/>
-          <w:numId w:val="1"/>
-        </w:numPr>
-        <w:spacing w:after="60" w:before="60" w:line="320" w:lineRule="auto"/>
-      </w:pPr>
-      <w:r>
-        <w:rPr>
-          <w:rFonts w:ascii="Calibri" w:cs="Calibri" w:eastAsia="Calibri" w:hAnsi="Calibri"/>
-          <w:color w:val="000000"/>
-          <w:sz w:val="22"/>
-          <w:szCs w:val="22"/>
-        </w:rPr>
-        <w:t xml:space="preserve">Jason Wise (Milestone Project Champion) or designee</w:t>
-      </w:r>
-    </w:p>
-    <w:p>
-      <w:pPr>
-        <w:pStyle w:val="ListParagraph"/>
-        <w:numPr>
-          <w:ilvl w:val="0"/>
-          <w:numId w:val="1"/>
-        </w:numPr>
-        <w:spacing w:after="60" w:before="60" w:line="320" w:lineRule="auto"/>
-      </w:pPr>
-      <w:r>
-        <w:rPr>
-          <w:rFonts w:ascii="Calibri" w:cs="Calibri" w:eastAsia="Calibri" w:hAnsi="Calibri"/>
-          <w:color w:val="000000"/>
-          <w:sz w:val="22"/>
-          <w:szCs w:val="22"/>
-        </w:rPr>
-        <w:t xml:space="preserve">Robert Strong (Milestone Operations Lead) as needed for data coordination sessions</w:t>
+        <w:t>Kyle Harbuck (Sayer Technical Oversight)</w:t>
+      </w:r>
+    </w:p>
+    <w:p>
+      <w:pPr>
+        <w:pStyle w:val="ListParagraph"/>
+        <w:numPr>
+          <w:ilvl w:val="0"/>
+          <w:numId w:val="1"/>
+        </w:numPr>
+        <w:spacing w:after="60" w:before="60" w:line="320" w:lineRule="auto"/>
+      </w:pPr>
+      <w:r>
+        <w:t>Weston Baker (Sayer Project Lead)</w:t>
+      </w:r>
+    </w:p>
+    <w:p>
+      <w:pPr>
+        <w:pStyle w:val="ListParagraph"/>
+        <w:numPr>
+          <w:ilvl w:val="0"/>
+          <w:numId w:val="1"/>
+        </w:numPr>
+        <w:spacing w:after="60" w:before="60" w:line="320" w:lineRule="auto"/>
+      </w:pPr>
+      <w:r>
+        <w:t>Robert Strong (Milestone Project Champion) or designee</w:t>
+      </w:r>
+    </w:p>
+    <w:p>
+      <w:pPr>
+        <w:pStyle w:val="ListParagraph"/>
+        <w:numPr>
+          <w:ilvl w:val="0"/>
+          <w:numId w:val="1"/>
+        </w:numPr>
+        <w:spacing w:after="60" w:before="60" w:line="320" w:lineRule="auto"/>
+      </w:pPr>
+      <w:r>
+        <w:t>Jason Wise (Milestone Executive Stakeholder) as needed for strategic discussions</w:t>
       </w:r>
     </w:p>
     <w:p>
@@ -1713,13 +1489,7 @@
         <w:spacing w:after="60" w:before="60" w:line="320" w:lineRule="auto"/>
       </w:pPr>
       <w:r>
-        <w:rPr>
-          <w:rFonts w:ascii="Calibri" w:cs="Calibri" w:eastAsia="Calibri" w:hAnsi="Calibri"/>
-          <w:color w:val="000000"/>
-          <w:sz w:val="22"/>
-          <w:szCs w:val="22"/>
-        </w:rPr>
-        <w:t xml:space="preserve">Weekly, Mondays at 2:00 PM Central, 30 minutes. Confirmed at kickoff.</w:t>
+        <w:t>Weekly, Tuesdays at 2:00 PM Central, 30 minutes. Confirmed at kickoff.</w:t>
       </w:r>
     </w:p>
     <w:p>
@@ -2210,15 +1980,7 @@
               <w:jc w:val="left"/>
             </w:pPr>
             <w:r>
-              <w:rPr>
-                <w:rFonts w:ascii="Calibri" w:cs="Calibri" w:eastAsia="Calibri" w:hAnsi="Calibri"/>
-                <w:b w:val="false"/>
-                <w:bCs w:val="false"/>
-                <w:color w:val="000000"/>
-                <w:sz w:val="22"/>
-                <w:szCs w:val="22"/>
-              </w:rPr>
-              <w:t xml:space="preserve">Project Champion, Sayer Project Lead, Sayer Executive Sponsor</w:t>
+              <w:t>Project Champion, Sayer Project Lead, Sayer Executive Sponsor</w:t>
             </w:r>
           </w:p>
         </w:tc>
@@ -2297,15 +2059,7 @@
               <w:jc w:val="left"/>
             </w:pPr>
             <w:r>
-              <w:rPr>
-                <w:rFonts w:ascii="Calibri" w:cs="Calibri" w:eastAsia="Calibri" w:hAnsi="Calibri"/>
-                <w:b w:val="false"/>
-                <w:bCs w:val="false"/>
-                <w:color w:val="000000"/>
-                <w:sz w:val="22"/>
-                <w:szCs w:val="22"/>
-              </w:rPr>
-              <w:t xml:space="preserve">Weekly (Mon 2pm CT)</w:t>
+              <w:t>Weekly (Tue 2pm CT)</w:t>
             </w:r>
           </w:p>
         </w:tc>
@@ -2325,15 +2079,7 @@
               <w:jc w:val="left"/>
             </w:pPr>
             <w:r>
-              <w:rPr>
-                <w:rFonts w:ascii="Calibri" w:cs="Calibri" w:eastAsia="Calibri" w:hAnsi="Calibri"/>
-                <w:b w:val="false"/>
-                <w:bCs w:val="false"/>
-                <w:color w:val="000000"/>
-                <w:sz w:val="22"/>
-                <w:szCs w:val="22"/>
-              </w:rPr>
-              <w:t xml:space="preserve">Sayer Project Lead, Sayer Project Support, Milestone Project Champion or designee</w:t>
+              <w:t>Sayer Project Lead (Weston), Sayer Technical Oversight (Kyle), Milestone Project Champion (Robert) or designee</w:t>
             </w:r>
           </w:p>
         </w:tc>
@@ -2674,15 +2420,7 @@
               <w:jc w:val="left"/>
             </w:pPr>
             <w:r>
-              <w:rPr>
-                <w:rFonts w:ascii="Calibri" w:cs="Calibri" w:eastAsia="Calibri" w:hAnsi="Calibri"/>
-                <w:b w:val="false"/>
-                <w:bCs w:val="false"/>
-                <w:color w:val="000000"/>
-                <w:sz w:val="22"/>
-                <w:szCs w:val="22"/>
-              </w:rPr>
-              <w:t xml:space="preserve">Project Champion, Operations Lead, power users + Sayer team</w:t>
+              <w:t>Project Champion, Executive Stakeholder, power users + Sayer team</w:t>
             </w:r>
           </w:p>
         </w:tc>

</xml_diff>